<commit_message>
Resume: Penetration Testing/Cyber Security Profile Work From Home Internship @ Unknown (unknown)
</commit_message>
<xml_diff>
--- a/resumes/Resume_Penetration_Testing_Cyber_Security__Unknown__unknown_.docx
+++ b/resumes/Resume_Penetration_Testing_Cyber_Security__Unknown__unknown_.docx
@@ -117,7 +117,7 @@
         <w:pBdr>
           <w:bottom w:val="single" w:sz="6" w:space="1" w:color="000000"/>
         </w:pBdr>
-        <w:spacing w:before="141" w:after="0"/>
+        <w:spacing w:before="113" w:after="0"/>
       </w:pPr>
       <w:r>
         <w:rPr>
@@ -289,7 +289,7 @@
     </w:p>
     <w:p>
       <w:pPr>
-        <w:spacing w:before="30" w:after="30"/>
+        <w:spacing w:before="23" w:after="23"/>
       </w:pPr>
     </w:p>
     <w:p>
@@ -297,7 +297,7 @@
         <w:pBdr>
           <w:bottom w:val="single" w:sz="6" w:space="1" w:color="000000"/>
         </w:pBdr>
-        <w:spacing w:before="141" w:after="0"/>
+        <w:spacing w:before="113" w:after="0"/>
       </w:pPr>
       <w:r>
         <w:rPr>
@@ -404,16 +404,16 @@
           <w:ilvl w:val="0"/>
           <w:numId w:val="2"/>
         </w:numPr>
-        <w:spacing w:before="13" w:after="38"/>
-      </w:pPr>
-      <w:r>
-        <w:rPr>
-          <w:rFonts w:ascii="Source Sans Pro" w:eastAsia="Source Sans Pro" w:hAnsi="Source Sans Pro" w:cs="Source Sans Pro"/>
-          <w:color w:val="000000"/>
-          <w:sz w:val="19"/>
-          <w:szCs w:val="19"/>
-        </w:rPr>
-        <w:t>Triaged 50+ weekly inventory reimbursement cases by severity and policy eligibility, reducing repeat-issue investigation time through timely decision-making.</w:t>
+        <w:spacing w:before="13" w:after="32"/>
+      </w:pPr>
+      <w:r>
+        <w:rPr>
+          <w:rFonts w:ascii="Source Sans Pro" w:eastAsia="Source Sans Pro" w:hAnsi="Source Sans Pro" w:cs="Source Sans Pro"/>
+          <w:color w:val="000000"/>
+          <w:sz w:val="19"/>
+          <w:szCs w:val="19"/>
+        </w:rPr>
+        <w:t>Triaged 50+ weekly inventory reimbursement cases by severity and policy eligibility, following structured case triage and escalation workflows, resulting in timely and accurate decision-making.</w:t>
       </w:r>
     </w:p>
     <w:p>
@@ -423,16 +423,16 @@
           <w:ilvl w:val="0"/>
           <w:numId w:val="2"/>
         </w:numPr>
-        <w:spacing w:before="13" w:after="38"/>
-      </w:pPr>
-      <w:r>
-        <w:rPr>
-          <w:rFonts w:ascii="Source Sans Pro" w:eastAsia="Source Sans Pro" w:hAnsi="Source Sans Pro" w:cs="Source Sans Pro"/>
-          <w:color w:val="000000"/>
-          <w:sz w:val="19"/>
-          <w:szCs w:val="19"/>
-        </w:rPr>
-        <w:t>Investigated root cause analysis on seller claims, identifying policy violations and anomalous patterns, and escalated findings to senior reviewers.</w:t>
+        <w:spacing w:before="13" w:after="32"/>
+      </w:pPr>
+      <w:r>
+        <w:rPr>
+          <w:rFonts w:ascii="Source Sans Pro" w:eastAsia="Source Sans Pro" w:hAnsi="Source Sans Pro" w:cs="Source Sans Pro"/>
+          <w:color w:val="000000"/>
+          <w:sz w:val="19"/>
+          <w:szCs w:val="19"/>
+        </w:rPr>
+        <w:t>Investigated root cause analysis on seller claims, identifying policy violations and anomalous patterns, and escalated findings to senior reviewers, leading to informed decision-making.</w:t>
       </w:r>
     </w:p>
     <w:p>
@@ -442,16 +442,16 @@
           <w:ilvl w:val="0"/>
           <w:numId w:val="2"/>
         </w:numPr>
-        <w:spacing w:before="13" w:after="38"/>
-      </w:pPr>
-      <w:r>
-        <w:rPr>
-          <w:rFonts w:ascii="Source Sans Pro" w:eastAsia="Source Sans Pro" w:hAnsi="Source Sans Pro" w:cs="Source Sans Pro"/>
-          <w:color w:val="000000"/>
-          <w:sz w:val="19"/>
-          <w:szCs w:val="19"/>
-        </w:rPr>
-        <w:t>Analyzed 200+ weekly cases to spot recurring fraud patterns and flagged them early, reducing repeat-issue investigation time before escalation and enhancing overall case efficiency.</w:t>
+        <w:spacing w:before="13" w:after="32"/>
+      </w:pPr>
+      <w:r>
+        <w:rPr>
+          <w:rFonts w:ascii="Source Sans Pro" w:eastAsia="Source Sans Pro" w:hAnsi="Source Sans Pro" w:cs="Source Sans Pro"/>
+          <w:color w:val="000000"/>
+          <w:sz w:val="19"/>
+          <w:szCs w:val="19"/>
+        </w:rPr>
+        <w:t>Analyzed 200+ weekly cases to spot recurring fraud patterns, flagging them early to reduce repeat-issue investigation time before escalation, resulting in efficient issue resolution.</w:t>
       </w:r>
     </w:p>
     <w:p>
@@ -461,21 +461,21 @@
           <w:ilvl w:val="0"/>
           <w:numId w:val="2"/>
         </w:numPr>
-        <w:spacing w:before="13" w:after="38"/>
-      </w:pPr>
-      <w:r>
-        <w:rPr>
-          <w:rFonts w:ascii="Source Sans Pro" w:eastAsia="Source Sans Pro" w:hAnsi="Source Sans Pro" w:cs="Source Sans Pro"/>
-          <w:color w:val="000000"/>
-          <w:sz w:val="19"/>
-          <w:szCs w:val="19"/>
-        </w:rPr>
-        <w:t>Documented audit-ready case records, including investigation findings, decisions, evidence, and corrective actions.</w:t>
-      </w:r>
-    </w:p>
-    <w:p>
-      <w:pPr>
-        <w:spacing w:before="30" w:after="30"/>
+        <w:spacing w:before="13" w:after="32"/>
+      </w:pPr>
+      <w:r>
+        <w:rPr>
+          <w:rFonts w:ascii="Source Sans Pro" w:eastAsia="Source Sans Pro" w:hAnsi="Source Sans Pro" w:cs="Source Sans Pro"/>
+          <w:color w:val="000000"/>
+          <w:sz w:val="19"/>
+          <w:szCs w:val="19"/>
+        </w:rPr>
+        <w:t>Documented audit-ready case records, capturing investigation findings, decisions, evidence notes, and corrective actions, ensuring transparent and accountable case management.</w:t>
+      </w:r>
+    </w:p>
+    <w:p>
+      <w:pPr>
+        <w:spacing w:before="23" w:after="23"/>
         <w:rPr>
           <w:rFonts w:ascii="Source Sans Pro" w:eastAsia="Source Sans Pro" w:hAnsi="Source Sans Pro" w:cs="Source Sans Pro"/>
           <w:b/>
@@ -488,8 +488,90 @@
     </w:p>
     <w:p>
       <w:pPr>
-        <w:spacing w:before="134" w:after="13"/>
-      </w:pPr>
+        <w:spacing w:before="106" w:after="0"/>
+        <w:rPr>
+          <w:rFonts w:ascii="Source Sans Pro" w:eastAsia="Source Sans Pro" w:hAnsi="Source Sans Pro" w:cs="Source Sans Pro"/>
+          <w:b/>
+          <w:bCs/>
+          <w:color w:val="000000"/>
+          <w:sz w:val="22"/>
+          <w:szCs w:val="22"/>
+        </w:rPr>
+      </w:pPr>
+      <w:r>
+        <w:rPr>
+          <w:rFonts w:ascii="SF Pro" w:hAnsi="SF Pro"/>
+          <w:noProof/>
+        </w:rPr>
+        <mc:AlternateContent>
+          <mc:Choice Requires="wps">
+            <w:drawing>
+              <wp:anchor distT="0" distB="0" distL="114300" distR="114300" simplePos="0" relativeHeight="251659264" behindDoc="0" locked="0" layoutInCell="1" allowOverlap="1" wp14:anchorId="491819C8" wp14:editId="10E86ACD">
+                <wp:simplePos x="0" y="0"/>
+                <wp:positionH relativeFrom="column">
+                  <wp:posOffset>0</wp:posOffset>
+                </wp:positionH>
+                <wp:positionV relativeFrom="paragraph">
+                  <wp:posOffset>226272</wp:posOffset>
+                </wp:positionV>
+                <wp:extent cx="6896478" cy="0"/>
+                <wp:effectExtent l="0" t="0" r="12700" b="12700"/>
+                <wp:wrapNone/>
+                <wp:docPr id="2078198358" name="Straight Connector 16"/>
+                <wp:cNvGraphicFramePr/>
+                <a:graphic xmlns:a="http://schemas.openxmlformats.org/drawingml/2006/main">
+                  <a:graphicData uri="http://schemas.microsoft.com/office/word/2010/wordprocessingShape">
+                    <wps:wsp>
+                      <wps:cNvCnPr/>
+                      <wps:spPr>
+                        <a:xfrm>
+                          <a:off x="0" y="0"/>
+                          <a:ext cx="6896478" cy="0"/>
+                        </a:xfrm>
+                        <a:prstGeom prst="line">
+                          <a:avLst/>
+                        </a:prstGeom>
+                        <a:ln>
+                          <a:solidFill>
+                            <a:schemeClr val="bg1">
+                              <a:lumMod val="85000"/>
+                            </a:schemeClr>
+                          </a:solidFill>
+                        </a:ln>
+                      </wps:spPr>
+                      <wps:style>
+                        <a:lnRef idx="1">
+                          <a:schemeClr val="dk1"/>
+                        </a:lnRef>
+                        <a:fillRef idx="0">
+                          <a:schemeClr val="dk1"/>
+                        </a:fillRef>
+                        <a:effectRef idx="0">
+                          <a:schemeClr val="dk1"/>
+                        </a:effectRef>
+                        <a:fontRef idx="minor">
+                          <a:schemeClr val="tx1"/>
+                        </a:fontRef>
+                      </wps:style>
+                      <wps:bodyPr/>
+                    </wps:wsp>
+                  </a:graphicData>
+                </a:graphic>
+                <wp14:sizeRelH relativeFrom="margin">
+                  <wp14:pctWidth>0</wp14:pctWidth>
+                </wp14:sizeRelH>
+              </wp:anchor>
+            </w:drawing>
+          </mc:Choice>
+          <mc:Fallback>
+            <w:pict>
+              <v:line w14:anchorId="0C62CE96" id="Straight Connector 16" o:spid="_x0000_s1026" style="position:absolute;z-index:251659264;visibility:visible;mso-wrap-style:square;mso-width-percent:0;mso-wrap-distance-left:9pt;mso-wrap-distance-top:0;mso-wrap-distance-right:9pt;mso-wrap-distance-bottom:0;mso-position-horizontal:absolute;mso-position-horizontal-relative:text;mso-position-vertical:absolute;mso-position-vertical-relative:text;mso-width-percent:0;mso-width-relative:margin" from="0,17.8pt" to="543.05pt,17.8pt" o:gfxdata="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" strokecolor="#d8d8d8 [2732]" strokeweight="1pt">
+                <v:stroke joinstyle="miter"/>
+              </v:line>
+            </w:pict>
+          </mc:Fallback>
+        </mc:AlternateContent>
+      </w:r>
       <w:r>
         <w:rPr>
           <w:rFonts w:ascii="Source Sans Pro" w:eastAsia="Source Sans Pro" w:hAnsi="Source Sans Pro" w:cs="Source Sans Pro"/>
@@ -519,7 +601,51 @@
             <w:szCs w:val="19"/>
             <w:u w:val="single"/>
           </w:rPr>
-          <w:t>Vulnerability Scanner and Patch Prioritization Engine</w:t>
+          <w:t>Vulnerability Scanner and Patch Prioritization Engine  |  Python, Bash, Nessus, OpenVAS, NVD API</w:t>
+        </w:r>
+        <w:r>
+          <w:rPr>
+            <w:rFonts w:ascii="Source Sans Pro" w:eastAsia="Source Sans Pro" w:hAnsi="Source Sans Pro" w:cs="Source Sans Pro"/>
+            <w:b/>
+            <w:color w:val="000000"/>
+            <w:sz w:val="19"/>
+            <w:szCs w:val="19"/>
+            <w:u w:val="single"/>
+          </w:rPr>
+          <w:t/>
+        </w:r>
+        <w:r>
+          <w:rPr>
+            <w:rFonts w:ascii="Source Sans Pro" w:eastAsia="Source Sans Pro" w:hAnsi="Source Sans Pro" w:cs="Source Sans Pro"/>
+            <w:b/>
+            <w:color w:val="000000"/>
+            <w:sz w:val="19"/>
+            <w:szCs w:val="19"/>
+            <w:u w:val="single"/>
+          </w:rPr>
+          <w:t/>
+        </w:r>
+        <w:r>
+          <w:rPr>
+            <w:rFonts w:ascii="Source Sans Pro" w:eastAsia="Source Sans Pro" w:hAnsi="Source Sans Pro" w:cs="Source Sans Pro"/>
+            <w:b/>
+            <w:color w:val="000000"/>
+            <w:sz w:val="19"/>
+            <w:szCs w:val="19"/>
+            <w:u w:val="single"/>
+          </w:rPr>
+          <w:t/>
+        </w:r>
+        <w:r>
+          <w:rPr>
+            <w:rFonts w:ascii="Source Sans Pro" w:eastAsia="Source Sans Pro" w:hAnsi="Source Sans Pro" w:cs="Source Sans Pro"/>
+            <w:b/>
+            <w:color w:val="000000"/>
+            <w:sz w:val="19"/>
+            <w:szCs w:val="19"/>
+            <w:u w:val="single"/>
+          </w:rPr>
+          <w:t/>
         </w:r>
       </w:hyperlink>
       <w:r>
@@ -528,7 +654,7 @@
           <w:sz w:val="19"/>
           <w:szCs w:val="19"/>
         </w:rPr>
-        <w:t xml:space="preserve">  |  </w:t>
+        <w:t xml:space="preserve"/>
       </w:r>
       <w:r>
         <w:rPr>
@@ -545,7 +671,7 @@
           <w:sz w:val="19"/>
           <w:szCs w:val="19"/>
         </w:rPr>
-        <w:t>Python, Bash, Nessus, OpenVAS, NVD API</w:t>
+        <w:t/>
       </w:r>
     </w:p>
     <w:p>
@@ -555,7 +681,7 @@
           <w:ilvl w:val="0"/>
           <w:numId w:val="2"/>
         </w:numPr>
-        <w:spacing w:before="13" w:after="38"/>
+        <w:spacing w:before="13" w:after="32"/>
       </w:pPr>
       <w:r>
         <w:rPr>
@@ -574,16 +700,16 @@
           <w:ilvl w:val="0"/>
           <w:numId w:val="2"/>
         </w:numPr>
-        <w:spacing w:before="13" w:after="38"/>
-      </w:pPr>
-      <w:r>
-        <w:rPr>
-          <w:rFonts w:ascii="Source Sans Pro" w:eastAsia="Source Sans Pro" w:hAnsi="Source Sans Pro" w:cs="Source Sans Pro"/>
-          <w:color w:val="000000"/>
-          <w:sz w:val="19"/>
-          <w:szCs w:val="19"/>
-        </w:rPr>
-        <w:t>Developed OWASP Top 10 automated web checker to detect injection, auth, and SSRF vulnerabilities via crafted HTTP requests; documented SQL injection exploit and remediation.</w:t>
+        <w:spacing w:before="13" w:after="32"/>
+      </w:pPr>
+      <w:r>
+        <w:rPr>
+          <w:rFonts w:ascii="Source Sans Pro" w:eastAsia="Source Sans Pro" w:hAnsi="Source Sans Pro" w:cs="Source Sans Pro"/>
+          <w:color w:val="000000"/>
+          <w:sz w:val="19"/>
+          <w:szCs w:val="19"/>
+        </w:rPr>
+        <w:t>Developed OWASP Top 10 automated web checker for detecting injection, auth, and SSRF vulnerabilities, documenting SQL injection exploit and remediation.</w:t>
       </w:r>
     </w:p>
     <w:p>
@@ -593,7 +719,7 @@
           <w:ilvl w:val="0"/>
           <w:numId w:val="2"/>
         </w:numPr>
-        <w:spacing w:before="13" w:after="38"/>
+        <w:spacing w:before="13" w:after="32"/>
       </w:pPr>
       <w:r>
         <w:rPr>
@@ -607,7 +733,7 @@
     </w:p>
     <w:p>
       <w:pPr>
-        <w:spacing w:before="30" w:after="30"/>
+        <w:spacing w:before="23" w:after="23"/>
       </w:pPr>
     </w:p>
     <w:p>
@@ -663,16 +789,16 @@
           <w:ilvl w:val="0"/>
           <w:numId w:val="2"/>
         </w:numPr>
-        <w:spacing w:before="13" w:after="38"/>
-      </w:pPr>
-      <w:r>
-        <w:rPr>
-          <w:rFonts w:ascii="Source Sans Pro" w:eastAsia="Source Sans Pro" w:hAnsi="Source Sans Pro" w:cs="Source Sans Pro"/>
-          <w:color w:val="000000"/>
-          <w:sz w:val="19"/>
-          <w:szCs w:val="19"/>
-        </w:rPr>
-        <w:t>Deployed Splunk SIEM with SPL correlation searches for brute-force detection, lateral movement, and privilege escalation, mapped to MITRE ATT&amp;CK TTPs, and wrote PICERL incident report.</w:t>
+        <w:spacing w:before="13" w:after="32"/>
+      </w:pPr>
+      <w:r>
+        <w:rPr>
+          <w:rFonts w:ascii="Source Sans Pro" w:eastAsia="Source Sans Pro" w:hAnsi="Source Sans Pro" w:cs="Source Sans Pro"/>
+          <w:color w:val="000000"/>
+          <w:sz w:val="19"/>
+          <w:szCs w:val="19"/>
+        </w:rPr>
+        <w:t>Deployed Splunk SIEM with SPL searches for brute-force detection, lateral movement, and privilege escalation; mapped TTPs to MITRE ATT&amp;CK and wrote PICERL incident report for FIRST.org.</w:t>
       </w:r>
     </w:p>
     <w:p>
@@ -682,7 +808,7 @@
           <w:ilvl w:val="0"/>
           <w:numId w:val="2"/>
         </w:numPr>
-        <w:spacing w:before="13" w:after="38"/>
+        <w:spacing w:before="13" w:after="32"/>
       </w:pPr>
       <w:r>
         <w:rPr>
@@ -701,22 +827,22 @@
           <w:ilvl w:val="0"/>
           <w:numId w:val="2"/>
         </w:numPr>
-        <w:spacing w:before="13" w:after="38"/>
-      </w:pPr>
-      <w:r>
-        <w:rPr>
-          <w:rFonts w:ascii="Source Sans Pro" w:eastAsia="Source Sans Pro" w:hAnsi="Source Sans Pro" w:cs="Source Sans Pro"/>
-          <w:color w:val="000000"/>
-          <w:sz w:val="19"/>
-          <w:szCs w:val="19"/>
-        </w:rPr>
-        <w:t>Converted detection logic to Sigma rules (detection-as-code) for enterprise SOCs; analyzed TCP/IP traffic in Wireshark for SYN scans, DNS tunnelling, and plaintext credential exposure.</w:t>
+        <w:spacing w:before="13" w:after="32"/>
+      </w:pPr>
+      <w:r>
+        <w:rPr>
+          <w:rFonts w:ascii="Source Sans Pro" w:eastAsia="Source Sans Pro" w:hAnsi="Source Sans Pro" w:cs="Source Sans Pro"/>
+          <w:color w:val="000000"/>
+          <w:sz w:val="19"/>
+          <w:szCs w:val="19"/>
+        </w:rPr>
+        <w:t>Converted detection logic to Sigma rules (detection-as-code) for enterprise SOCs; analyzed TCP/IP in Wireshark for SYN scans, DNS tunnelling, and plaintext credential exposure.</w:t>
       </w:r>
     </w:p>
     <w:p>
       <w:pPr>
         <w:pStyle w:val="ListParagraph"/>
-        <w:spacing w:before="30" w:after="30"/>
+        <w:spacing w:before="23" w:after="23"/>
         <w:ind w:left="450"/>
       </w:pPr>
     </w:p>
@@ -725,7 +851,7 @@
         <w:pBdr>
           <w:bottom w:val="single" w:sz="6" w:space="1" w:color="000000"/>
         </w:pBdr>
-        <w:spacing w:before="141" w:after="0"/>
+        <w:spacing w:before="113" w:after="0"/>
       </w:pPr>
       <w:r>
         <w:rPr>
@@ -741,7 +867,7 @@
     </w:p>
     <w:p>
       <w:pPr>
-        <w:spacing w:before="54" w:after="54"/>
+        <w:spacing w:before="47" w:after="47"/>
       </w:pPr>
       <w:r>
         <w:rPr>
@@ -763,7 +889,7 @@
     </w:p>
     <w:p>
       <w:pPr>
-        <w:spacing w:before="54" w:after="54"/>
+        <w:spacing w:before="47" w:after="47"/>
       </w:pPr>
       <w:r>
         <w:rPr>
@@ -785,7 +911,7 @@
     </w:p>
     <w:p>
       <w:pPr>
-        <w:spacing w:before="54" w:after="54"/>
+        <w:spacing w:before="47" w:after="47"/>
       </w:pPr>
       <w:r>
         <w:rPr>
@@ -807,7 +933,7 @@
     </w:p>
     <w:p>
       <w:pPr>
-        <w:spacing w:before="54" w:after="54"/>
+        <w:spacing w:before="47" w:after="47"/>
       </w:pPr>
       <w:r>
         <w:rPr>
@@ -829,7 +955,7 @@
     </w:p>
     <w:p>
       <w:pPr>
-        <w:spacing w:before="54" w:after="54"/>
+        <w:spacing w:before="47" w:after="36"/>
       </w:pPr>
       <w:r>
         <w:rPr>
@@ -854,7 +980,7 @@
         <w:pBdr>
           <w:bottom w:val="single" w:sz="6" w:space="1" w:color="000000"/>
         </w:pBdr>
-        <w:spacing w:before="30" w:after="30"/>
+        <w:spacing w:before="23" w:after="23"/>
         <w:rPr>
           <w:rFonts w:ascii="Source Sans Pro" w:eastAsia="Source Sans Pro" w:hAnsi="Source Sans Pro" w:cs="Source Sans Pro"/>
           <w:b/>
@@ -870,7 +996,7 @@
         <w:pBdr>
           <w:bottom w:val="single" w:sz="6" w:space="1" w:color="000000"/>
         </w:pBdr>
-        <w:spacing w:before="141" w:after="0"/>
+        <w:spacing w:before="113" w:after="0"/>
       </w:pPr>
       <w:r>
         <w:rPr>
@@ -891,7 +1017,7 @@
           <w:ilvl w:val="0"/>
           <w:numId w:val="2"/>
         </w:numPr>
-        <w:spacing w:before="13" w:after="38"/>
+        <w:spacing w:before="13" w:after="32"/>
       </w:pPr>
       <w:r>
         <w:rPr>
@@ -910,7 +1036,7 @@
           <w:ilvl w:val="0"/>
           <w:numId w:val="2"/>
         </w:numPr>
-        <w:spacing w:before="13" w:after="38"/>
+        <w:spacing w:before="13" w:after="32"/>
       </w:pPr>
       <w:r>
         <w:rPr>

</xml_diff>